<commit_message>
Drei Schritte zum guten Prompt im Nachmittagsteil ergaenzt
Grund und Ziel nennen, zeigen statt beschreiben, sagen was fertig heisst.
Neue Folie in der Nachmittags-Keynote, Abschnitt im Arbeitsauftrag (Web und
Word), Verweis im Werkzeugkasten. Dazu prompt-drei.svg und ein Beispiel-Prompt
zum Kopieren.

Co-Authored-By: Claude Opus 5 <noreply@anthropic.com>
</commit_message>
<xml_diff>
--- a/6_Arbeitsauftrag_Nachmittag.docx
+++ b/6_Arbeitsauftrag_Nachmittag.docx
@@ -112,6 +112,142 @@
       </w:tr>
     </w:tbl>
     <w:p/>
+    <w:p>
+      <w:pPr>
+        <w:pStyle w:val="Heading1"/>
+      </w:pPr>
+      <w:r>
+        <w:t>Drei Schritte zu einem guten Prompt</w:t>
+      </w:r>
+    </w:p>
+    <w:p>
+      <w:pPr>
+        <w:spacing w:after="120"/>
+      </w:pPr>
+      <w:r>
+        <w:rPr>
+          <w:b w:val="0"/>
+          <w:i/>
+          <w:color w:val="5D6B62"/>
+        </w:rPr>
+        <w:t>Ein Prompt ist die Anweisung, die ihr der KI gebt. Die drei Schritte gelten für Gemini genauso wie für NotebookLM, egal welchen Weg ihr danach wählt.</w:t>
+      </w:r>
+    </w:p>
+    <w:p>
+      <w:pPr>
+        <w:pStyle w:val="Heading2"/>
+      </w:pPr>
+      <w:r>
+        <w:t>Schritt 1 · Der Grund und das Ziel</w:t>
+      </w:r>
+    </w:p>
+    <w:p>
+      <w:pPr>
+        <w:spacing w:after="120"/>
+      </w:pPr>
+      <w:r>
+        <w:rPr>
+          <w:b w:val="0"/>
+          <w:i w:val="0"/>
+        </w:rPr>
+        <w:t>Sagt, für wen das Material ist, wozu es dient und wo eure Lerngruppe gerade steht. Ein Satz reicht. Fehlt er, schreibt die KI für irgendjemanden.</w:t>
+      </w:r>
+    </w:p>
+    <w:p>
+      <w:pPr>
+        <w:pStyle w:val="Heading2"/>
+      </w:pPr>
+      <w:r>
+        <w:t>Schritt 2 · Zeigen statt beschreiben</w:t>
+      </w:r>
+    </w:p>
+    <w:p>
+      <w:pPr>
+        <w:spacing w:after="120"/>
+      </w:pPr>
+      <w:r>
+        <w:rPr>
+          <w:b w:val="0"/>
+          <w:i w:val="0"/>
+        </w:rPr>
+        <w:t>Hängt an, was ihr schon habt: das alte Arbeitsblatt als Foto, eure Notizen, die Schulbuchseite als PDF, einen Link. Ein Beispiel ist mehr wert als drei Absätze Erklärung. Auf dem Privat-Konto dürft ihr das alles hochladen.</w:t>
+      </w:r>
+    </w:p>
+    <w:p>
+      <w:pPr>
+        <w:pStyle w:val="Heading2"/>
+      </w:pPr>
+      <w:r>
+        <w:t>Schritt 3 · Was fertig heißt</w:t>
+      </w:r>
+    </w:p>
+    <w:p>
+      <w:pPr>
+        <w:spacing w:after="120"/>
+      </w:pPr>
+      <w:r>
+        <w:rPr>
+          <w:b w:val="0"/>
+          <w:i w:val="0"/>
+        </w:rPr>
+        <w:t>Sagt, woran ihr merkt, dass es passt: eine Seite, sechs Aufgaben, Lösungen am Ende. Und sagt dazu, was nicht hineingehört, sonst schreibt die KI drumherum.</w:t>
+      </w:r>
+    </w:p>
+    <w:p>
+      <w:pPr>
+        <w:spacing w:after="120"/>
+      </w:pPr>
+      <w:r>
+        <w:rPr>
+          <w:b w:val="0"/>
+          <w:i w:val="0"/>
+        </w:rPr>
+        <w:t>So sehen die drei Schritte zusammen in einem Prompt aus:</w:t>
+      </w:r>
+    </w:p>
+    <w:tbl>
+      <w:tblPr>
+        <w:tblW w:type="auto" w:w="0"/>
+        <w:jc w:val="center"/>
+        <w:tblLayout w:type="autofit"/>
+        <w:tblLook w:firstColumn="1" w:firstRow="1" w:lastColumn="0" w:lastRow="0" w:noHBand="0" w:noVBand="1" w:val="04A0"/>
+      </w:tblPr>
+      <w:tblGrid>
+        <w:gridCol w:w="8640"/>
+      </w:tblGrid>
+      <w:tr>
+        <w:tc>
+          <w:tcPr>
+            <w:tcW w:type="dxa" w:w="8640"/>
+            <w:shd w:val="clear" w:color="auto" w:fill="EDF2EE"/>
+          </w:tcPr>
+          <w:p>
+            <w:pPr>
+              <w:spacing w:after="40"/>
+            </w:pPr>
+            <w:r>
+              <w:rPr>
+                <w:rFonts w:ascii="Consolas" w:hAnsi="Consolas"/>
+                <w:b w:val="0"/>
+                <w:sz w:val="20"/>
+              </w:rPr>
+              <w:t>Ich brauche ein Arbeitsblatt für eine 8. Klasse Physik, dritte Stunde zum Hebelgesetz, als Übung vor der Klassenarbeit. Das angehängte Blatt vom letzten Jahr zeigt, wie ich so etwas aufbaue. Fertig ist es, wenn es auf eine Seite passt, sechs Aufgaben mit steigender Schwierigkeit enthält und die Lösungen am Ende stehen. Versuchsbeschreibungen brauche ich nicht, die machen wir vorher im Unterricht.</w:t>
+            </w:r>
+          </w:p>
+        </w:tc>
+      </w:tr>
+    </w:tbl>
+    <w:p>
+      <w:pPr>
+        <w:spacing w:after="120"/>
+      </w:pPr>
+      <w:r>
+        <w:rPr>
+          <w:b w:val="0"/>
+          <w:i w:val="0"/>
+        </w:rPr>
+      </w:r>
+    </w:p>
     <w:p>
       <w:pPr>
         <w:pStyle w:val="Heading1"/>

</xml_diff>